<commit_message>
Sync report drafts and recommendation UX updates
</commit_message>
<xml_diff>
--- a/DSProject_Proposal.docx
+++ b/DSProject_Proposal.docx
@@ -1,6 +1,6 @@
 
 <file path=word/document.xml><?xml version="1.0" encoding="utf-8"?>
-<w:document xmlns:wpc="http://schemas.microsoft.com/office/word/2010/wordprocessingCanvas" xmlns:cx="http://schemas.microsoft.com/office/drawing/2014/chartex" xmlns:cx1="http://schemas.microsoft.com/office/drawing/2015/9/8/chartex" xmlns:cx2="http://schemas.microsoft.com/office/drawing/2015/10/21/chartex" xmlns:cx3="http://schemas.microsoft.com/office/drawing/2016/5/9/chartex" xmlns:cx4="http://schemas.microsoft.com/office/drawing/2016/5/10/chartex" xmlns:cx5="http://schemas.microsoft.com/office/drawing/2016/5/11/chartex" xmlns:cx6="http://schemas.microsoft.com/office/drawing/2016/5/12/chartex" xmlns:cx7="http://schemas.microsoft.com/office/drawing/2016/5/13/chartex" xmlns:cx8="http://schemas.microsoft.com/office/drawing/2016/5/14/chartex" xmlns:mc="http://schemas.openxmlformats.org/markup-compatibility/2006" xmlns:aink="http://schemas.microsoft.com/office/drawing/2016/ink" xmlns:am3d="http://schemas.microsoft.com/office/drawing/2017/model3d" xmlns:o="urn:schemas-microsoft-com:office:office" xmlns:oel="http://schemas.microsoft.com/office/2019/extlst" xmlns:r="http://schemas.openxmlformats.org/officeDocument/2006/relationships" xmlns:m="http://schemas.openxmlformats.org/officeDocument/2006/math" xmlns:v="urn:schemas-microsoft-com:vml" xmlns:wp14="http://schemas.microsoft.com/office/word/2010/wordprocessingDrawing" xmlns:wp="http://schemas.openxmlformats.org/drawingml/2006/wordprocessingDrawing" xmlns:w10="urn:schemas-microsoft-com:office:word" xmlns:w="http://schemas.openxmlformats.org/wordprocessingml/2006/main" xmlns:w14="http://schemas.microsoft.com/office/word/2010/wordml" xmlns:w15="http://schemas.microsoft.com/office/word/2012/wordml" xmlns:w16cex="http://schemas.microsoft.com/office/word/2018/wordml/cex" xmlns:w16cid="http://schemas.microsoft.com/office/word/2016/wordml/cid" xmlns:w16="http://schemas.microsoft.com/office/word/2018/wordml" xmlns:w16du="http://schemas.microsoft.com/office/word/2023/wordml/word16du" xmlns:w16sdtdh="http://schemas.microsoft.com/office/word/2020/wordml/sdtdatahash" xmlns:w16se="http://schemas.microsoft.com/office/word/2015/wordml/symex" xmlns:wpg="http://schemas.microsoft.com/office/word/2010/wordprocessingGroup" xmlns:wpi="http://schemas.microsoft.com/office/word/2010/wordprocessingInk" xmlns:wne="http://schemas.microsoft.com/office/word/2006/wordml" xmlns:wps="http://schemas.microsoft.com/office/word/2010/wordprocessingShape" mc:Ignorable="w14 w15 w16se w16cid w16 w16cex w16sdtdh w16du wp14">
+<w:document xmlns:wpc="http://schemas.microsoft.com/office/word/2010/wordprocessingCanvas" xmlns:cx="http://schemas.microsoft.com/office/drawing/2014/chartex" xmlns:cx1="http://schemas.microsoft.com/office/drawing/2015/9/8/chartex" xmlns:cx2="http://schemas.microsoft.com/office/drawing/2015/10/21/chartex" xmlns:cx3="http://schemas.microsoft.com/office/drawing/2016/5/9/chartex" xmlns:cx4="http://schemas.microsoft.com/office/drawing/2016/5/10/chartex" xmlns:cx5="http://schemas.microsoft.com/office/drawing/2016/5/11/chartex" xmlns:cx6="http://schemas.microsoft.com/office/drawing/2016/5/12/chartex" xmlns:cx7="http://schemas.microsoft.com/office/drawing/2016/5/13/chartex" xmlns:cx8="http://schemas.microsoft.com/office/drawing/2016/5/14/chartex" xmlns:mc="http://schemas.openxmlformats.org/markup-compatibility/2006" xmlns:aink="http://schemas.microsoft.com/office/drawing/2016/ink" xmlns:am3d="http://schemas.microsoft.com/office/drawing/2017/model3d" xmlns:o="urn:schemas-microsoft-com:office:office" xmlns:oel="http://schemas.microsoft.com/office/2019/extlst" xmlns:r="http://schemas.openxmlformats.org/officeDocument/2006/relationships" xmlns:m="http://schemas.openxmlformats.org/officeDocument/2006/math" xmlns:v="urn:schemas-microsoft-com:vml" xmlns:wp14="http://schemas.microsoft.com/office/word/2010/wordprocessingDrawing" xmlns:wp="http://schemas.openxmlformats.org/drawingml/2006/wordprocessingDrawing" xmlns:w10="urn:schemas-microsoft-com:office:word" xmlns:w="http://schemas.openxmlformats.org/wordprocessingml/2006/main" xmlns:w14="http://schemas.microsoft.com/office/word/2010/wordml" xmlns:w15="http://schemas.microsoft.com/office/word/2012/wordml" xmlns:w16cex="http://schemas.microsoft.com/office/word/2018/wordml/cex" xmlns:w16cid="http://schemas.microsoft.com/office/word/2016/wordml/cid" xmlns:w16="http://schemas.microsoft.com/office/word/2018/wordml" xmlns:w16du="http://schemas.microsoft.com/office/word/2023/wordml/word16du" xmlns:w16sdtdh="http://schemas.microsoft.com/office/word/2020/wordml/sdtdatahash" xmlns:w16sdtfl="http://schemas.microsoft.com/office/word/2024/wordml/sdtformatlock" xmlns:w16se="http://schemas.microsoft.com/office/word/2015/wordml/symex" xmlns:wpg="http://schemas.microsoft.com/office/word/2010/wordprocessingGroup" xmlns:wpi="http://schemas.microsoft.com/office/word/2010/wordprocessingInk" xmlns:wne="http://schemas.microsoft.com/office/word/2006/wordml" xmlns:wps="http://schemas.microsoft.com/office/word/2010/wordprocessingShape" mc:Ignorable="w14 w15 w16se w16cid w16 w16cex w16sdtdh w16sdtfl w16du wp14">
   <w:body>
     <w:p>
       <w:pPr>
@@ -125,16 +125,130 @@
                 <w:szCs w:val="20"/>
               </w:rPr>
             </w:pPr>
-          </w:p>
-          <w:p>
-            <w:pPr>
-              <w:widowControl w:val="0"/>
-              <w:jc w:val="both"/>
+            <w:r>
               <w:rPr>
                 <w:sz w:val="20"/>
                 <w:szCs w:val="20"/>
               </w:rPr>
-            </w:pPr>
+              <w:t>JD Allen (</w:t>
+            </w:r>
+            <w:hyperlink r:id="rId11" w:history="1">
+              <w:r>
+                <w:rPr>
+                  <w:rStyle w:val="Hyperlink"/>
+                  <w:sz w:val="20"/>
+                  <w:szCs w:val="20"/>
+                </w:rPr>
+                <w:t>JD.Allen@ttu.edu</w:t>
+              </w:r>
+            </w:hyperlink>
+            <w:r>
+              <w:rPr>
+                <w:sz w:val="20"/>
+                <w:szCs w:val="20"/>
+              </w:rPr>
+              <w:t>), Amanda Jinks (</w:t>
+            </w:r>
+            <w:hyperlink r:id="rId12" w:history="1">
+              <w:r>
+                <w:rPr>
+                  <w:rStyle w:val="Hyperlink"/>
+                  <w:sz w:val="20"/>
+                  <w:szCs w:val="20"/>
+                </w:rPr>
+                <w:t>ajinks@ttu.edu</w:t>
+              </w:r>
+            </w:hyperlink>
+            <w:r>
+              <w:rPr>
+                <w:sz w:val="20"/>
+                <w:szCs w:val="20"/>
+              </w:rPr>
+              <w:t>)</w:t>
+            </w:r>
+            <w:r>
+              <w:rPr>
+                <w:sz w:val="20"/>
+                <w:szCs w:val="20"/>
+              </w:rPr>
+              <w:t>, Pedro Hernandez-Lopez (</w:t>
+            </w:r>
+            <w:hyperlink r:id="rId13" w:history="1">
+              <w:r>
+                <w:rPr>
+                  <w:rStyle w:val="Hyperlink"/>
+                  <w:sz w:val="20"/>
+                  <w:szCs w:val="20"/>
+                </w:rPr>
+                <w:t>her11223@ttu.edu</w:t>
+              </w:r>
+            </w:hyperlink>
+            <w:r>
+              <w:rPr>
+                <w:sz w:val="20"/>
+                <w:szCs w:val="20"/>
+              </w:rPr>
+              <w:t>)</w:t>
+            </w:r>
+            <w:r>
+              <w:rPr>
+                <w:sz w:val="20"/>
+                <w:szCs w:val="20"/>
+              </w:rPr>
+              <w:t xml:space="preserve">, </w:t>
+            </w:r>
+            <w:r>
+              <w:rPr>
+                <w:sz w:val="20"/>
+                <w:szCs w:val="20"/>
+              </w:rPr>
+              <w:t xml:space="preserve"> Serena</w:t>
+            </w:r>
+            <w:r>
+              <w:rPr>
+                <w:sz w:val="20"/>
+                <w:szCs w:val="20"/>
+              </w:rPr>
+              <w:t xml:space="preserve"> Zachariah </w:t>
+            </w:r>
+            <w:r>
+              <w:rPr>
+                <w:sz w:val="20"/>
+                <w:szCs w:val="20"/>
+              </w:rPr>
+              <w:t>(</w:t>
+            </w:r>
+            <w:hyperlink r:id="rId14" w:history="1">
+              <w:r>
+                <w:rPr>
+                  <w:rStyle w:val="Hyperlink"/>
+                  <w:sz w:val="20"/>
+                  <w:szCs w:val="20"/>
+                </w:rPr>
+                <w:t>serzacha@ttu.edu</w:t>
+              </w:r>
+            </w:hyperlink>
+            <w:r>
+              <w:rPr>
+                <w:sz w:val="20"/>
+                <w:szCs w:val="20"/>
+              </w:rPr>
+              <w:t>)</w:t>
+            </w:r>
+            <w:r>
+              <w:rPr>
+                <w:sz w:val="20"/>
+                <w:szCs w:val="20"/>
+              </w:rPr>
+              <w:t xml:space="preserve"> </w:t>
+            </w:r>
+            <w:r>
+              <w:rPr>
+                <w:sz w:val="20"/>
+                <w:szCs w:val="20"/>
+              </w:rPr>
+              <w:t xml:space="preserve"> </w:t>
+            </w:r>
           </w:p>
         </w:tc>
       </w:tr>
@@ -189,6 +303,13 @@
                 <w:szCs w:val="20"/>
               </w:rPr>
             </w:pPr>
+            <w:r>
+              <w:rPr>
+                <w:sz w:val="20"/>
+                <w:szCs w:val="20"/>
+              </w:rPr>
+              <w:t>College Compass</w:t>
+            </w:r>
           </w:p>
         </w:tc>
       </w:tr>
@@ -278,6 +399,20 @@
                 <w:szCs w:val="20"/>
               </w:rPr>
             </w:pPr>
+            <w:r>
+              <w:rPr>
+                <w:sz w:val="20"/>
+                <w:szCs w:val="20"/>
+              </w:rPr>
+              <w:t>G</w:t>
+            </w:r>
+            <w:r>
+              <w:rPr>
+                <w:sz w:val="20"/>
+                <w:szCs w:val="20"/>
+              </w:rPr>
+              <w:t>raduation, Affordability, Matching</w:t>
+            </w:r>
           </w:p>
         </w:tc>
       </w:tr>
@@ -381,6 +516,13 @@
                 <w:szCs w:val="20"/>
               </w:rPr>
             </w:pPr>
+            <w:r>
+              <w:rPr>
+                <w:sz w:val="20"/>
+                <w:szCs w:val="20"/>
+              </w:rPr>
+              <w:t>Outcomes, Location, Trajectory</w:t>
+            </w:r>
           </w:p>
         </w:tc>
       </w:tr>
@@ -442,6 +584,13 @@
                 <w:szCs w:val="20"/>
               </w:rPr>
             </w:pPr>
+            <w:r>
+              <w:rPr>
+                <w:sz w:val="20"/>
+                <w:szCs w:val="20"/>
+              </w:rPr>
+              <w:t>Data-Driven College Matching Using Institutional Quality, Cost, and Graduation Outcomes</w:t>
+            </w:r>
           </w:p>
           <w:p>
             <w:pPr>
@@ -527,6 +676,13 @@
                 <w:szCs w:val="20"/>
               </w:rPr>
             </w:pPr>
+            <w:r>
+              <w:rPr>
+                <w:sz w:val="20"/>
+                <w:szCs w:val="20"/>
+              </w:rPr>
+              <w:t>Trend-Aware Campus Recommendation Engine for Affordability, Regional Fit, and Student Success</w:t>
+            </w:r>
           </w:p>
           <w:p>
             <w:pPr>
@@ -612,6 +768,13 @@
                 <w:szCs w:val="20"/>
               </w:rPr>
             </w:pPr>
+            <w:r>
+              <w:rPr>
+                <w:sz w:val="20"/>
+                <w:szCs w:val="20"/>
+              </w:rPr>
+              <w:t>IPEDS 2022–2024 HD, IC, ADM, SFA, COST, EF, GR files; optional College Scorecard outcomes enrichment</w:t>
+            </w:r>
           </w:p>
           <w:p>
             <w:pPr>
@@ -697,6 +860,29 @@
                 <w:szCs w:val="20"/>
               </w:rPr>
             </w:pPr>
+            <w:r>
+              <w:rPr>
+                <w:sz w:val="20"/>
+                <w:szCs w:val="20"/>
+              </w:rPr>
+              <w:t xml:space="preserve">Build reproducible pipeline, engineer institution features, train baseline models, compute weighted fit scores, and return </w:t>
+            </w:r>
+            <w:proofErr w:type="gramStart"/>
+            <w:r>
+              <w:rPr>
+                <w:sz w:val="20"/>
+                <w:szCs w:val="20"/>
+              </w:rPr>
+              <w:t>top-3</w:t>
+            </w:r>
+            <w:proofErr w:type="gramEnd"/>
+            <w:r>
+              <w:rPr>
+                <w:sz w:val="20"/>
+                <w:szCs w:val="20"/>
+              </w:rPr>
+              <w:t xml:space="preserve"> explainable recommendations under budget and location constraints</w:t>
+            </w:r>
           </w:p>
           <w:p>
             <w:pPr>
@@ -818,15 +1004,7 @@
                 <w:sz w:val="20"/>
                 <w:szCs w:val="20"/>
               </w:rPr>
-              <w:t xml:space="preserve"> </w:t>
-            </w:r>
-            <w:r>
-              <w:rPr>
-                <w:rFonts w:ascii="Times New Roman" w:hAnsi="Times New Roman" w:cs="Times New Roman"/>
-                <w:sz w:val="20"/>
-                <w:szCs w:val="20"/>
-              </w:rPr>
-              <w:t xml:space="preserve">   </w:t>
+              <w:t>Cost and aid variables strongly influence top-match rankings.</w:t>
             </w:r>
           </w:p>
           <w:p>
@@ -850,7 +1028,7 @@
                 <w:sz w:val="20"/>
                 <w:szCs w:val="20"/>
               </w:rPr>
-              <w:t xml:space="preserve"> </w:t>
+              <w:t>Graduation-based quality proxies improve recommendation precision.</w:t>
             </w:r>
           </w:p>
           <w:p>
@@ -874,7 +1052,25 @@
                 <w:sz w:val="20"/>
                 <w:szCs w:val="20"/>
               </w:rPr>
-              <w:t xml:space="preserve"> </w:t>
+              <w:t xml:space="preserve">Regional preference materially changes </w:t>
+            </w:r>
+            <w:proofErr w:type="gramStart"/>
+            <w:r>
+              <w:rPr>
+                <w:rFonts w:ascii="Times New Roman" w:hAnsi="Times New Roman" w:cs="Times New Roman"/>
+                <w:sz w:val="20"/>
+                <w:szCs w:val="20"/>
+              </w:rPr>
+              <w:t>top-3</w:t>
+            </w:r>
+            <w:proofErr w:type="gramEnd"/>
+            <w:r>
+              <w:rPr>
+                <w:rFonts w:ascii="Times New Roman" w:hAnsi="Times New Roman" w:cs="Times New Roman"/>
+                <w:sz w:val="20"/>
+                <w:szCs w:val="20"/>
+              </w:rPr>
+              <w:t xml:space="preserve"> outputs.</w:t>
             </w:r>
           </w:p>
           <w:p>
@@ -898,7 +1094,7 @@
                 <w:sz w:val="20"/>
                 <w:szCs w:val="20"/>
               </w:rPr>
-              <w:t xml:space="preserve"> </w:t>
+              <w:t>Trend features (cost growth, completion slope) improve robustness over single-year snapshots.</w:t>
             </w:r>
           </w:p>
           <w:p>
@@ -922,6 +1118,56 @@
                 <w:sz w:val="20"/>
                 <w:szCs w:val="20"/>
               </w:rPr>
+              <w:t xml:space="preserve">Explainable </w:t>
+            </w:r>
+            <w:proofErr w:type="gramStart"/>
+            <w:r>
+              <w:rPr>
+                <w:rFonts w:ascii="Times New Roman" w:hAnsi="Times New Roman" w:cs="Times New Roman"/>
+                <w:sz w:val="20"/>
+                <w:szCs w:val="20"/>
+              </w:rPr>
+              <w:t>factor breakdown increases</w:t>
+            </w:r>
+            <w:proofErr w:type="gramEnd"/>
+            <w:r>
+              <w:rPr>
+                <w:rFonts w:ascii="Times New Roman" w:hAnsi="Times New Roman" w:cs="Times New Roman"/>
+                <w:sz w:val="20"/>
+                <w:szCs w:val="20"/>
+              </w:rPr>
+              <w:t xml:space="preserve"> trust and usability.</w:t>
+            </w:r>
+          </w:p>
+          <w:p>
+            <w:pPr>
+              <w:pStyle w:val="ListParagraph"/>
+              <w:widowControl w:val="0"/>
+              <w:numPr>
+                <w:ilvl w:val="0"/>
+                <w:numId w:val="50"/>
+              </w:numPr>
+              <w:jc w:val="both"/>
+              <w:rPr>
+                <w:rFonts w:ascii="Times New Roman" w:hAnsi="Times New Roman" w:cs="Times New Roman"/>
+                <w:sz w:val="20"/>
+                <w:szCs w:val="20"/>
+              </w:rPr>
+            </w:pPr>
+            <w:r>
+              <w:rPr>
+                <w:rFonts w:ascii="Times New Roman" w:hAnsi="Times New Roman" w:cs="Times New Roman"/>
+                <w:sz w:val="20"/>
+                <w:szCs w:val="20"/>
+              </w:rPr>
+              <w:t>Career outcomes need external enrichment for stronger validity.</w:t>
+            </w:r>
+            <w:r>
+              <w:rPr>
+                <w:rFonts w:ascii="Times New Roman" w:hAnsi="Times New Roman" w:cs="Times New Roman"/>
+                <w:sz w:val="20"/>
+                <w:szCs w:val="20"/>
+              </w:rPr>
               <w:t xml:space="preserve">  </w:t>
             </w:r>
           </w:p>
@@ -950,8 +1196,8 @@
     </w:p>
     <w:p/>
     <w:sectPr>
-      <w:headerReference w:type="default" r:id="rId8"/>
-      <w:footerReference w:type="default" r:id="rId9"/>
+      <w:headerReference w:type="default" r:id="rId15"/>
+      <w:footerReference w:type="default" r:id="rId16"/>
       <w:pgSz w:w="12240" w:h="15840"/>
       <w:pgMar w:top="1440" w:right="1440" w:bottom="1440" w:left="1440" w:header="720" w:footer="720" w:gutter="0"/>
       <w:cols w:space="720"/>
@@ -962,7 +1208,7 @@
 </file>
 
 <file path=word/endnotes.xml><?xml version="1.0" encoding="utf-8"?>
-<w:endnotes xmlns:wpc="http://schemas.microsoft.com/office/word/2010/wordprocessingCanvas" xmlns:cx="http://schemas.microsoft.com/office/drawing/2014/chartex" xmlns:cx1="http://schemas.microsoft.com/office/drawing/2015/9/8/chartex" xmlns:cx2="http://schemas.microsoft.com/office/drawing/2015/10/21/chartex" xmlns:cx3="http://schemas.microsoft.com/office/drawing/2016/5/9/chartex" xmlns:cx4="http://schemas.microsoft.com/office/drawing/2016/5/10/chartex" xmlns:cx5="http://schemas.microsoft.com/office/drawing/2016/5/11/chartex" xmlns:cx6="http://schemas.microsoft.com/office/drawing/2016/5/12/chartex" xmlns:cx7="http://schemas.microsoft.com/office/drawing/2016/5/13/chartex" xmlns:cx8="http://schemas.microsoft.com/office/drawing/2016/5/14/chartex" xmlns:mc="http://schemas.openxmlformats.org/markup-compatibility/2006" xmlns:aink="http://schemas.microsoft.com/office/drawing/2016/ink" xmlns:am3d="http://schemas.microsoft.com/office/drawing/2017/model3d" xmlns:o="urn:schemas-microsoft-com:office:office" xmlns:oel="http://schemas.microsoft.com/office/2019/extlst" xmlns:r="http://schemas.openxmlformats.org/officeDocument/2006/relationships" xmlns:m="http://schemas.openxmlformats.org/officeDocument/2006/math" xmlns:v="urn:schemas-microsoft-com:vml" xmlns:wp14="http://schemas.microsoft.com/office/word/2010/wordprocessingDrawing" xmlns:wp="http://schemas.openxmlformats.org/drawingml/2006/wordprocessingDrawing" xmlns:w10="urn:schemas-microsoft-com:office:word" xmlns:w="http://schemas.openxmlformats.org/wordprocessingml/2006/main" xmlns:w14="http://schemas.microsoft.com/office/word/2010/wordml" xmlns:w15="http://schemas.microsoft.com/office/word/2012/wordml" xmlns:w16cex="http://schemas.microsoft.com/office/word/2018/wordml/cex" xmlns:w16cid="http://schemas.microsoft.com/office/word/2016/wordml/cid" xmlns:w16="http://schemas.microsoft.com/office/word/2018/wordml" xmlns:w16du="http://schemas.microsoft.com/office/word/2023/wordml/word16du" xmlns:w16sdtdh="http://schemas.microsoft.com/office/word/2020/wordml/sdtdatahash" xmlns:w16se="http://schemas.microsoft.com/office/word/2015/wordml/symex" xmlns:wpg="http://schemas.microsoft.com/office/word/2010/wordprocessingGroup" xmlns:wpi="http://schemas.microsoft.com/office/word/2010/wordprocessingInk" xmlns:wne="http://schemas.microsoft.com/office/word/2006/wordml" xmlns:wps="http://schemas.microsoft.com/office/word/2010/wordprocessingShape" mc:Ignorable="w14 w15 w16se w16cid w16 w16cex w16sdtdh w16du wp14">
+<w:endnotes xmlns:wpc="http://schemas.microsoft.com/office/word/2010/wordprocessingCanvas" xmlns:cx="http://schemas.microsoft.com/office/drawing/2014/chartex" xmlns:cx1="http://schemas.microsoft.com/office/drawing/2015/9/8/chartex" xmlns:cx2="http://schemas.microsoft.com/office/drawing/2015/10/21/chartex" xmlns:cx3="http://schemas.microsoft.com/office/drawing/2016/5/9/chartex" xmlns:cx4="http://schemas.microsoft.com/office/drawing/2016/5/10/chartex" xmlns:cx5="http://schemas.microsoft.com/office/drawing/2016/5/11/chartex" xmlns:cx6="http://schemas.microsoft.com/office/drawing/2016/5/12/chartex" xmlns:cx7="http://schemas.microsoft.com/office/drawing/2016/5/13/chartex" xmlns:cx8="http://schemas.microsoft.com/office/drawing/2016/5/14/chartex" xmlns:mc="http://schemas.openxmlformats.org/markup-compatibility/2006" xmlns:aink="http://schemas.microsoft.com/office/drawing/2016/ink" xmlns:am3d="http://schemas.microsoft.com/office/drawing/2017/model3d" xmlns:o="urn:schemas-microsoft-com:office:office" xmlns:oel="http://schemas.microsoft.com/office/2019/extlst" xmlns:r="http://schemas.openxmlformats.org/officeDocument/2006/relationships" xmlns:m="http://schemas.openxmlformats.org/officeDocument/2006/math" xmlns:v="urn:schemas-microsoft-com:vml" xmlns:wp14="http://schemas.microsoft.com/office/word/2010/wordprocessingDrawing" xmlns:wp="http://schemas.openxmlformats.org/drawingml/2006/wordprocessingDrawing" xmlns:w10="urn:schemas-microsoft-com:office:word" xmlns:w="http://schemas.openxmlformats.org/wordprocessingml/2006/main" xmlns:w14="http://schemas.microsoft.com/office/word/2010/wordml" xmlns:w15="http://schemas.microsoft.com/office/word/2012/wordml" xmlns:w16cex="http://schemas.microsoft.com/office/word/2018/wordml/cex" xmlns:w16cid="http://schemas.microsoft.com/office/word/2016/wordml/cid" xmlns:w16="http://schemas.microsoft.com/office/word/2018/wordml" xmlns:w16du="http://schemas.microsoft.com/office/word/2023/wordml/word16du" xmlns:w16sdtdh="http://schemas.microsoft.com/office/word/2020/wordml/sdtdatahash" xmlns:w16sdtfl="http://schemas.microsoft.com/office/word/2024/wordml/sdtformatlock" xmlns:w16se="http://schemas.microsoft.com/office/word/2015/wordml/symex" xmlns:wpg="http://schemas.microsoft.com/office/word/2010/wordprocessingGroup" xmlns:wpi="http://schemas.microsoft.com/office/word/2010/wordprocessingInk" xmlns:wne="http://schemas.microsoft.com/office/word/2006/wordml" xmlns:wps="http://schemas.microsoft.com/office/word/2010/wordprocessingShape" mc:Ignorable="w14 w15 w16se w16cid w16 w16cex w16sdtdh w16sdtfl w16du wp14">
   <w:endnote w:type="separator" w:id="-1">
     <w:p>
       <w:r>
@@ -981,7 +1227,7 @@
 </file>
 
 <file path=word/footer1.xml><?xml version="1.0" encoding="utf-8"?>
-<w:ftr xmlns:wpc="http://schemas.microsoft.com/office/word/2010/wordprocessingCanvas" xmlns:cx="http://schemas.microsoft.com/office/drawing/2014/chartex" xmlns:cx1="http://schemas.microsoft.com/office/drawing/2015/9/8/chartex" xmlns:cx2="http://schemas.microsoft.com/office/drawing/2015/10/21/chartex" xmlns:cx3="http://schemas.microsoft.com/office/drawing/2016/5/9/chartex" xmlns:cx4="http://schemas.microsoft.com/office/drawing/2016/5/10/chartex" xmlns:cx5="http://schemas.microsoft.com/office/drawing/2016/5/11/chartex" xmlns:cx6="http://schemas.microsoft.com/office/drawing/2016/5/12/chartex" xmlns:cx7="http://schemas.microsoft.com/office/drawing/2016/5/13/chartex" xmlns:cx8="http://schemas.microsoft.com/office/drawing/2016/5/14/chartex" xmlns:mc="http://schemas.openxmlformats.org/markup-compatibility/2006" xmlns:aink="http://schemas.microsoft.com/office/drawing/2016/ink" xmlns:am3d="http://schemas.microsoft.com/office/drawing/2017/model3d" xmlns:o="urn:schemas-microsoft-com:office:office" xmlns:oel="http://schemas.microsoft.com/office/2019/extlst" xmlns:r="http://schemas.openxmlformats.org/officeDocument/2006/relationships" xmlns:m="http://schemas.openxmlformats.org/officeDocument/2006/math" xmlns:v="urn:schemas-microsoft-com:vml" xmlns:wp14="http://schemas.microsoft.com/office/word/2010/wordprocessingDrawing" xmlns:wp="http://schemas.openxmlformats.org/drawingml/2006/wordprocessingDrawing" xmlns:w10="urn:schemas-microsoft-com:office:word" xmlns:w="http://schemas.openxmlformats.org/wordprocessingml/2006/main" xmlns:w14="http://schemas.microsoft.com/office/word/2010/wordml" xmlns:w15="http://schemas.microsoft.com/office/word/2012/wordml" xmlns:w16cex="http://schemas.microsoft.com/office/word/2018/wordml/cex" xmlns:w16cid="http://schemas.microsoft.com/office/word/2016/wordml/cid" xmlns:w16="http://schemas.microsoft.com/office/word/2018/wordml" xmlns:w16du="http://schemas.microsoft.com/office/word/2023/wordml/word16du" xmlns:w16sdtdh="http://schemas.microsoft.com/office/word/2020/wordml/sdtdatahash" xmlns:w16se="http://schemas.microsoft.com/office/word/2015/wordml/symex" xmlns:wpg="http://schemas.microsoft.com/office/word/2010/wordprocessingGroup" xmlns:wpi="http://schemas.microsoft.com/office/word/2010/wordprocessingInk" xmlns:wne="http://schemas.microsoft.com/office/word/2006/wordml" xmlns:wps="http://schemas.microsoft.com/office/word/2010/wordprocessingShape" mc:Ignorable="w14 w15 w16se w16cid w16 w16cex w16sdtdh w16du wp14">
+<w:ftr xmlns:wpc="http://schemas.microsoft.com/office/word/2010/wordprocessingCanvas" xmlns:cx="http://schemas.microsoft.com/office/drawing/2014/chartex" xmlns:cx1="http://schemas.microsoft.com/office/drawing/2015/9/8/chartex" xmlns:cx2="http://schemas.microsoft.com/office/drawing/2015/10/21/chartex" xmlns:cx3="http://schemas.microsoft.com/office/drawing/2016/5/9/chartex" xmlns:cx4="http://schemas.microsoft.com/office/drawing/2016/5/10/chartex" xmlns:cx5="http://schemas.microsoft.com/office/drawing/2016/5/11/chartex" xmlns:cx6="http://schemas.microsoft.com/office/drawing/2016/5/12/chartex" xmlns:cx7="http://schemas.microsoft.com/office/drawing/2016/5/13/chartex" xmlns:cx8="http://schemas.microsoft.com/office/drawing/2016/5/14/chartex" xmlns:mc="http://schemas.openxmlformats.org/markup-compatibility/2006" xmlns:aink="http://schemas.microsoft.com/office/drawing/2016/ink" xmlns:am3d="http://schemas.microsoft.com/office/drawing/2017/model3d" xmlns:o="urn:schemas-microsoft-com:office:office" xmlns:oel="http://schemas.microsoft.com/office/2019/extlst" xmlns:r="http://schemas.openxmlformats.org/officeDocument/2006/relationships" xmlns:m="http://schemas.openxmlformats.org/officeDocument/2006/math" xmlns:v="urn:schemas-microsoft-com:vml" xmlns:wp14="http://schemas.microsoft.com/office/word/2010/wordprocessingDrawing" xmlns:wp="http://schemas.openxmlformats.org/drawingml/2006/wordprocessingDrawing" xmlns:w10="urn:schemas-microsoft-com:office:word" xmlns:w="http://schemas.openxmlformats.org/wordprocessingml/2006/main" xmlns:w14="http://schemas.microsoft.com/office/word/2010/wordml" xmlns:w15="http://schemas.microsoft.com/office/word/2012/wordml" xmlns:w16cex="http://schemas.microsoft.com/office/word/2018/wordml/cex" xmlns:w16cid="http://schemas.microsoft.com/office/word/2016/wordml/cid" xmlns:w16="http://schemas.microsoft.com/office/word/2018/wordml" xmlns:w16du="http://schemas.microsoft.com/office/word/2023/wordml/word16du" xmlns:w16sdtdh="http://schemas.microsoft.com/office/word/2020/wordml/sdtdatahash" xmlns:w16sdtfl="http://schemas.microsoft.com/office/word/2024/wordml/sdtformatlock" xmlns:w16se="http://schemas.microsoft.com/office/word/2015/wordml/symex" xmlns:wpg="http://schemas.microsoft.com/office/word/2010/wordprocessingGroup" xmlns:wpi="http://schemas.microsoft.com/office/word/2010/wordprocessingInk" xmlns:wne="http://schemas.microsoft.com/office/word/2006/wordml" xmlns:wps="http://schemas.microsoft.com/office/word/2010/wordprocessingShape" mc:Ignorable="w14 w15 w16se w16cid w16 w16cex w16sdtdh w16sdtfl w16du wp14">
   <w:sdt>
     <w:sdtPr>
       <w:id w:val="-1024555742"/>
@@ -1056,7 +1302,7 @@
 </file>
 
 <file path=word/footnotes.xml><?xml version="1.0" encoding="utf-8"?>
-<w:footnotes xmlns:wpc="http://schemas.microsoft.com/office/word/2010/wordprocessingCanvas" xmlns:cx="http://schemas.microsoft.com/office/drawing/2014/chartex" xmlns:cx1="http://schemas.microsoft.com/office/drawing/2015/9/8/chartex" xmlns:cx2="http://schemas.microsoft.com/office/drawing/2015/10/21/chartex" xmlns:cx3="http://schemas.microsoft.com/office/drawing/2016/5/9/chartex" xmlns:cx4="http://schemas.microsoft.com/office/drawing/2016/5/10/chartex" xmlns:cx5="http://schemas.microsoft.com/office/drawing/2016/5/11/chartex" xmlns:cx6="http://schemas.microsoft.com/office/drawing/2016/5/12/chartex" xmlns:cx7="http://schemas.microsoft.com/office/drawing/2016/5/13/chartex" xmlns:cx8="http://schemas.microsoft.com/office/drawing/2016/5/14/chartex" xmlns:mc="http://schemas.openxmlformats.org/markup-compatibility/2006" xmlns:aink="http://schemas.microsoft.com/office/drawing/2016/ink" xmlns:am3d="http://schemas.microsoft.com/office/drawing/2017/model3d" xmlns:o="urn:schemas-microsoft-com:office:office" xmlns:oel="http://schemas.microsoft.com/office/2019/extlst" xmlns:r="http://schemas.openxmlformats.org/officeDocument/2006/relationships" xmlns:m="http://schemas.openxmlformats.org/officeDocument/2006/math" xmlns:v="urn:schemas-microsoft-com:vml" xmlns:wp14="http://schemas.microsoft.com/office/word/2010/wordprocessingDrawing" xmlns:wp="http://schemas.openxmlformats.org/drawingml/2006/wordprocessingDrawing" xmlns:w10="urn:schemas-microsoft-com:office:word" xmlns:w="http://schemas.openxmlformats.org/wordprocessingml/2006/main" xmlns:w14="http://schemas.microsoft.com/office/word/2010/wordml" xmlns:w15="http://schemas.microsoft.com/office/word/2012/wordml" xmlns:w16cex="http://schemas.microsoft.com/office/word/2018/wordml/cex" xmlns:w16cid="http://schemas.microsoft.com/office/word/2016/wordml/cid" xmlns:w16="http://schemas.microsoft.com/office/word/2018/wordml" xmlns:w16du="http://schemas.microsoft.com/office/word/2023/wordml/word16du" xmlns:w16sdtdh="http://schemas.microsoft.com/office/word/2020/wordml/sdtdatahash" xmlns:w16se="http://schemas.microsoft.com/office/word/2015/wordml/symex" xmlns:wpg="http://schemas.microsoft.com/office/word/2010/wordprocessingGroup" xmlns:wpi="http://schemas.microsoft.com/office/word/2010/wordprocessingInk" xmlns:wne="http://schemas.microsoft.com/office/word/2006/wordml" xmlns:wps="http://schemas.microsoft.com/office/word/2010/wordprocessingShape" mc:Ignorable="w14 w15 w16se w16cid w16 w16cex w16sdtdh w16du wp14">
+<w:footnotes xmlns:wpc="http://schemas.microsoft.com/office/word/2010/wordprocessingCanvas" xmlns:cx="http://schemas.microsoft.com/office/drawing/2014/chartex" xmlns:cx1="http://schemas.microsoft.com/office/drawing/2015/9/8/chartex" xmlns:cx2="http://schemas.microsoft.com/office/drawing/2015/10/21/chartex" xmlns:cx3="http://schemas.microsoft.com/office/drawing/2016/5/9/chartex" xmlns:cx4="http://schemas.microsoft.com/office/drawing/2016/5/10/chartex" xmlns:cx5="http://schemas.microsoft.com/office/drawing/2016/5/11/chartex" xmlns:cx6="http://schemas.microsoft.com/office/drawing/2016/5/12/chartex" xmlns:cx7="http://schemas.microsoft.com/office/drawing/2016/5/13/chartex" xmlns:cx8="http://schemas.microsoft.com/office/drawing/2016/5/14/chartex" xmlns:mc="http://schemas.openxmlformats.org/markup-compatibility/2006" xmlns:aink="http://schemas.microsoft.com/office/drawing/2016/ink" xmlns:am3d="http://schemas.microsoft.com/office/drawing/2017/model3d" xmlns:o="urn:schemas-microsoft-com:office:office" xmlns:oel="http://schemas.microsoft.com/office/2019/extlst" xmlns:r="http://schemas.openxmlformats.org/officeDocument/2006/relationships" xmlns:m="http://schemas.openxmlformats.org/officeDocument/2006/math" xmlns:v="urn:schemas-microsoft-com:vml" xmlns:wp14="http://schemas.microsoft.com/office/word/2010/wordprocessingDrawing" xmlns:wp="http://schemas.openxmlformats.org/drawingml/2006/wordprocessingDrawing" xmlns:w10="urn:schemas-microsoft-com:office:word" xmlns:w="http://schemas.openxmlformats.org/wordprocessingml/2006/main" xmlns:w14="http://schemas.microsoft.com/office/word/2010/wordml" xmlns:w15="http://schemas.microsoft.com/office/word/2012/wordml" xmlns:w16cex="http://schemas.microsoft.com/office/word/2018/wordml/cex" xmlns:w16cid="http://schemas.microsoft.com/office/word/2016/wordml/cid" xmlns:w16="http://schemas.microsoft.com/office/word/2018/wordml" xmlns:w16du="http://schemas.microsoft.com/office/word/2023/wordml/word16du" xmlns:w16sdtdh="http://schemas.microsoft.com/office/word/2020/wordml/sdtdatahash" xmlns:w16sdtfl="http://schemas.microsoft.com/office/word/2024/wordml/sdtformatlock" xmlns:w16se="http://schemas.microsoft.com/office/word/2015/wordml/symex" xmlns:wpg="http://schemas.microsoft.com/office/word/2010/wordprocessingGroup" xmlns:wpi="http://schemas.microsoft.com/office/word/2010/wordprocessingInk" xmlns:wne="http://schemas.microsoft.com/office/word/2006/wordml" xmlns:wps="http://schemas.microsoft.com/office/word/2010/wordprocessingShape" mc:Ignorable="w14 w15 w16se w16cid w16 w16cex w16sdtdh w16sdtfl w16du wp14">
   <w:footnote w:type="separator" w:id="-1">
     <w:p>
       <w:r>
@@ -1075,7 +1321,7 @@
 </file>
 
 <file path=word/header1.xml><?xml version="1.0" encoding="utf-8"?>
-<w:hdr xmlns:wpc="http://schemas.microsoft.com/office/word/2010/wordprocessingCanvas" xmlns:cx="http://schemas.microsoft.com/office/drawing/2014/chartex" xmlns:cx1="http://schemas.microsoft.com/office/drawing/2015/9/8/chartex" xmlns:cx2="http://schemas.microsoft.com/office/drawing/2015/10/21/chartex" xmlns:cx3="http://schemas.microsoft.com/office/drawing/2016/5/9/chartex" xmlns:cx4="http://schemas.microsoft.com/office/drawing/2016/5/10/chartex" xmlns:cx5="http://schemas.microsoft.com/office/drawing/2016/5/11/chartex" xmlns:cx6="http://schemas.microsoft.com/office/drawing/2016/5/12/chartex" xmlns:cx7="http://schemas.microsoft.com/office/drawing/2016/5/13/chartex" xmlns:cx8="http://schemas.microsoft.com/office/drawing/2016/5/14/chartex" xmlns:mc="http://schemas.openxmlformats.org/markup-compatibility/2006" xmlns:aink="http://schemas.microsoft.com/office/drawing/2016/ink" xmlns:am3d="http://schemas.microsoft.com/office/drawing/2017/model3d" xmlns:o="urn:schemas-microsoft-com:office:office" xmlns:oel="http://schemas.microsoft.com/office/2019/extlst" xmlns:r="http://schemas.openxmlformats.org/officeDocument/2006/relationships" xmlns:m="http://schemas.openxmlformats.org/officeDocument/2006/math" xmlns:v="urn:schemas-microsoft-com:vml" xmlns:wp14="http://schemas.microsoft.com/office/word/2010/wordprocessingDrawing" xmlns:wp="http://schemas.openxmlformats.org/drawingml/2006/wordprocessingDrawing" xmlns:w10="urn:schemas-microsoft-com:office:word" xmlns:w="http://schemas.openxmlformats.org/wordprocessingml/2006/main" xmlns:w14="http://schemas.microsoft.com/office/word/2010/wordml" xmlns:w15="http://schemas.microsoft.com/office/word/2012/wordml" xmlns:w16cex="http://schemas.microsoft.com/office/word/2018/wordml/cex" xmlns:w16cid="http://schemas.microsoft.com/office/word/2016/wordml/cid" xmlns:w16="http://schemas.microsoft.com/office/word/2018/wordml" xmlns:w16du="http://schemas.microsoft.com/office/word/2023/wordml/word16du" xmlns:w16sdtdh="http://schemas.microsoft.com/office/word/2020/wordml/sdtdatahash" xmlns:w16se="http://schemas.microsoft.com/office/word/2015/wordml/symex" xmlns:wpg="http://schemas.microsoft.com/office/word/2010/wordprocessingGroup" xmlns:wpi="http://schemas.microsoft.com/office/word/2010/wordprocessingInk" xmlns:wne="http://schemas.microsoft.com/office/word/2006/wordml" xmlns:wps="http://schemas.microsoft.com/office/word/2010/wordprocessingShape" mc:Ignorable="w14 w15 w16se w16cid w16 w16cex w16sdtdh w16du wp14">
+<w:hdr xmlns:wpc="http://schemas.microsoft.com/office/word/2010/wordprocessingCanvas" xmlns:cx="http://schemas.microsoft.com/office/drawing/2014/chartex" xmlns:cx1="http://schemas.microsoft.com/office/drawing/2015/9/8/chartex" xmlns:cx2="http://schemas.microsoft.com/office/drawing/2015/10/21/chartex" xmlns:cx3="http://schemas.microsoft.com/office/drawing/2016/5/9/chartex" xmlns:cx4="http://schemas.microsoft.com/office/drawing/2016/5/10/chartex" xmlns:cx5="http://schemas.microsoft.com/office/drawing/2016/5/11/chartex" xmlns:cx6="http://schemas.microsoft.com/office/drawing/2016/5/12/chartex" xmlns:cx7="http://schemas.microsoft.com/office/drawing/2016/5/13/chartex" xmlns:cx8="http://schemas.microsoft.com/office/drawing/2016/5/14/chartex" xmlns:mc="http://schemas.openxmlformats.org/markup-compatibility/2006" xmlns:aink="http://schemas.microsoft.com/office/drawing/2016/ink" xmlns:am3d="http://schemas.microsoft.com/office/drawing/2017/model3d" xmlns:o="urn:schemas-microsoft-com:office:office" xmlns:oel="http://schemas.microsoft.com/office/2019/extlst" xmlns:r="http://schemas.openxmlformats.org/officeDocument/2006/relationships" xmlns:m="http://schemas.openxmlformats.org/officeDocument/2006/math" xmlns:v="urn:schemas-microsoft-com:vml" xmlns:wp14="http://schemas.microsoft.com/office/word/2010/wordprocessingDrawing" xmlns:wp="http://schemas.openxmlformats.org/drawingml/2006/wordprocessingDrawing" xmlns:w10="urn:schemas-microsoft-com:office:word" xmlns:w="http://schemas.openxmlformats.org/wordprocessingml/2006/main" xmlns:w14="http://schemas.microsoft.com/office/word/2010/wordml" xmlns:w15="http://schemas.microsoft.com/office/word/2012/wordml" xmlns:w16cex="http://schemas.microsoft.com/office/word/2018/wordml/cex" xmlns:w16cid="http://schemas.microsoft.com/office/word/2016/wordml/cid" xmlns:w16="http://schemas.microsoft.com/office/word/2018/wordml" xmlns:w16du="http://schemas.microsoft.com/office/word/2023/wordml/word16du" xmlns:w16sdtdh="http://schemas.microsoft.com/office/word/2020/wordml/sdtdatahash" xmlns:w16sdtfl="http://schemas.microsoft.com/office/word/2024/wordml/sdtformatlock" xmlns:w16se="http://schemas.microsoft.com/office/word/2015/wordml/symex" xmlns:wpg="http://schemas.microsoft.com/office/word/2010/wordprocessingGroup" xmlns:wpi="http://schemas.microsoft.com/office/word/2010/wordprocessingInk" xmlns:wne="http://schemas.microsoft.com/office/word/2006/wordml" xmlns:wps="http://schemas.microsoft.com/office/word/2010/wordprocessingShape" mc:Ignorable="w14 w15 w16se w16cid w16 w16cex w16sdtdh w16sdtfl w16du wp14">
   <w:p>
     <w:pPr>
       <w:pStyle w:val="Header"/>
@@ -1092,14 +1338,22 @@
         <w:sz w:val="18"/>
         <w:szCs w:val="18"/>
       </w:rPr>
-      <w:t>Proposal/Team Nickname</w:t>
+      <w:t>Proposal/</w:t>
+    </w:r>
+    <w:r>
+      <w:rPr>
+        <w:rFonts w:ascii="Times New Roman" w:hAnsi="Times New Roman" w:cs="Times New Roman"/>
+        <w:sz w:val="18"/>
+        <w:szCs w:val="18"/>
+      </w:rPr>
+      <w:t>College Compass</w:t>
     </w:r>
   </w:p>
 </w:hdr>
 </file>
 
 <file path=word/numbering.xml><?xml version="1.0" encoding="utf-8"?>
-<w:numbering xmlns:wpc="http://schemas.microsoft.com/office/word/2010/wordprocessingCanvas" xmlns:cx="http://schemas.microsoft.com/office/drawing/2014/chartex" xmlns:cx1="http://schemas.microsoft.com/office/drawing/2015/9/8/chartex" xmlns:cx2="http://schemas.microsoft.com/office/drawing/2015/10/21/chartex" xmlns:cx3="http://schemas.microsoft.com/office/drawing/2016/5/9/chartex" xmlns:cx4="http://schemas.microsoft.com/office/drawing/2016/5/10/chartex" xmlns:cx5="http://schemas.microsoft.com/office/drawing/2016/5/11/chartex" xmlns:cx6="http://schemas.microsoft.com/office/drawing/2016/5/12/chartex" xmlns:cx7="http://schemas.microsoft.com/office/drawing/2016/5/13/chartex" xmlns:cx8="http://schemas.microsoft.com/office/drawing/2016/5/14/chartex" xmlns:mc="http://schemas.openxmlformats.org/markup-compatibility/2006" xmlns:aink="http://schemas.microsoft.com/office/drawing/2016/ink" xmlns:am3d="http://schemas.microsoft.com/office/drawing/2017/model3d" xmlns:o="urn:schemas-microsoft-com:office:office" xmlns:oel="http://schemas.microsoft.com/office/2019/extlst" xmlns:r="http://schemas.openxmlformats.org/officeDocument/2006/relationships" xmlns:m="http://schemas.openxmlformats.org/officeDocument/2006/math" xmlns:v="urn:schemas-microsoft-com:vml" xmlns:wp14="http://schemas.microsoft.com/office/word/2010/wordprocessingDrawing" xmlns:wp="http://schemas.openxmlformats.org/drawingml/2006/wordprocessingDrawing" xmlns:w10="urn:schemas-microsoft-com:office:word" xmlns:w="http://schemas.openxmlformats.org/wordprocessingml/2006/main" xmlns:w14="http://schemas.microsoft.com/office/word/2010/wordml" xmlns:w15="http://schemas.microsoft.com/office/word/2012/wordml" xmlns:w16cex="http://schemas.microsoft.com/office/word/2018/wordml/cex" xmlns:w16cid="http://schemas.microsoft.com/office/word/2016/wordml/cid" xmlns:w16="http://schemas.microsoft.com/office/word/2018/wordml" xmlns:w16du="http://schemas.microsoft.com/office/word/2023/wordml/word16du" xmlns:w16sdtdh="http://schemas.microsoft.com/office/word/2020/wordml/sdtdatahash" xmlns:w16se="http://schemas.microsoft.com/office/word/2015/wordml/symex" xmlns:wpg="http://schemas.microsoft.com/office/word/2010/wordprocessingGroup" xmlns:wpi="http://schemas.microsoft.com/office/word/2010/wordprocessingInk" xmlns:wne="http://schemas.microsoft.com/office/word/2006/wordml" xmlns:wps="http://schemas.microsoft.com/office/word/2010/wordprocessingShape" mc:Ignorable="w14 w15 w16se w16cid w16 w16cex w16sdtdh w16du wp14">
+<w:numbering xmlns:wpc="http://schemas.microsoft.com/office/word/2010/wordprocessingCanvas" xmlns:cx="http://schemas.microsoft.com/office/drawing/2014/chartex" xmlns:cx1="http://schemas.microsoft.com/office/drawing/2015/9/8/chartex" xmlns:cx2="http://schemas.microsoft.com/office/drawing/2015/10/21/chartex" xmlns:cx3="http://schemas.microsoft.com/office/drawing/2016/5/9/chartex" xmlns:cx4="http://schemas.microsoft.com/office/drawing/2016/5/10/chartex" xmlns:cx5="http://schemas.microsoft.com/office/drawing/2016/5/11/chartex" xmlns:cx6="http://schemas.microsoft.com/office/drawing/2016/5/12/chartex" xmlns:cx7="http://schemas.microsoft.com/office/drawing/2016/5/13/chartex" xmlns:cx8="http://schemas.microsoft.com/office/drawing/2016/5/14/chartex" xmlns:mc="http://schemas.openxmlformats.org/markup-compatibility/2006" xmlns:aink="http://schemas.microsoft.com/office/drawing/2016/ink" xmlns:am3d="http://schemas.microsoft.com/office/drawing/2017/model3d" xmlns:o="urn:schemas-microsoft-com:office:office" xmlns:oel="http://schemas.microsoft.com/office/2019/extlst" xmlns:r="http://schemas.openxmlformats.org/officeDocument/2006/relationships" xmlns:m="http://schemas.openxmlformats.org/officeDocument/2006/math" xmlns:v="urn:schemas-microsoft-com:vml" xmlns:wp14="http://schemas.microsoft.com/office/word/2010/wordprocessingDrawing" xmlns:wp="http://schemas.openxmlformats.org/drawingml/2006/wordprocessingDrawing" xmlns:w10="urn:schemas-microsoft-com:office:word" xmlns:w="http://schemas.openxmlformats.org/wordprocessingml/2006/main" xmlns:w14="http://schemas.microsoft.com/office/word/2010/wordml" xmlns:w15="http://schemas.microsoft.com/office/word/2012/wordml" xmlns:w16cex="http://schemas.microsoft.com/office/word/2018/wordml/cex" xmlns:w16cid="http://schemas.microsoft.com/office/word/2016/wordml/cid" xmlns:w16="http://schemas.microsoft.com/office/word/2018/wordml" xmlns:w16du="http://schemas.microsoft.com/office/word/2023/wordml/word16du" xmlns:w16sdtdh="http://schemas.microsoft.com/office/word/2020/wordml/sdtdatahash" xmlns:w16sdtfl="http://schemas.microsoft.com/office/word/2024/wordml/sdtformatlock" xmlns:w16se="http://schemas.microsoft.com/office/word/2015/wordml/symex" xmlns:wpg="http://schemas.microsoft.com/office/word/2010/wordprocessingGroup" xmlns:wpi="http://schemas.microsoft.com/office/word/2010/wordprocessingInk" xmlns:wne="http://schemas.microsoft.com/office/word/2006/wordml" xmlns:wps="http://schemas.microsoft.com/office/word/2010/wordprocessingShape" mc:Ignorable="w14 w15 w16se w16cid w16 w16cex w16sdtdh w16sdtfl w16du wp14">
   <w:abstractNum w:abstractNumId="0" w15:restartNumberingAfterBreak="0">
     <w:nsid w:val="04B555B0"/>
     <w:multiLevelType w:val="hybridMultilevel"/>
@@ -6480,7 +6734,7 @@
 </file>
 
 <file path=word/styles.xml><?xml version="1.0" encoding="utf-8"?>
-<w:styles xmlns:mc="http://schemas.openxmlformats.org/markup-compatibility/2006" xmlns:r="http://schemas.openxmlformats.org/officeDocument/2006/relationships" xmlns:w="http://schemas.openxmlformats.org/wordprocessingml/2006/main" xmlns:w14="http://schemas.microsoft.com/office/word/2010/wordml" xmlns:w15="http://schemas.microsoft.com/office/word/2012/wordml" xmlns:w16cex="http://schemas.microsoft.com/office/word/2018/wordml/cex" xmlns:w16cid="http://schemas.microsoft.com/office/word/2016/wordml/cid" xmlns:w16="http://schemas.microsoft.com/office/word/2018/wordml" xmlns:w16du="http://schemas.microsoft.com/office/word/2023/wordml/word16du" xmlns:w16sdtdh="http://schemas.microsoft.com/office/word/2020/wordml/sdtdatahash" xmlns:w16se="http://schemas.microsoft.com/office/word/2015/wordml/symex" mc:Ignorable="w14 w15 w16se w16cid w16 w16cex w16sdtdh w16du">
+<w:styles xmlns:mc="http://schemas.openxmlformats.org/markup-compatibility/2006" xmlns:r="http://schemas.openxmlformats.org/officeDocument/2006/relationships" xmlns:w="http://schemas.openxmlformats.org/wordprocessingml/2006/main" xmlns:w14="http://schemas.microsoft.com/office/word/2010/wordml" xmlns:w15="http://schemas.microsoft.com/office/word/2012/wordml" xmlns:w16cex="http://schemas.microsoft.com/office/word/2018/wordml/cex" xmlns:w16cid="http://schemas.microsoft.com/office/word/2016/wordml/cid" xmlns:w16="http://schemas.microsoft.com/office/word/2018/wordml" xmlns:w16du="http://schemas.microsoft.com/office/word/2023/wordml/word16du" xmlns:w16sdtdh="http://schemas.microsoft.com/office/word/2020/wordml/sdtdatahash" xmlns:w16sdtfl="http://schemas.microsoft.com/office/word/2024/wordml/sdtformatlock" xmlns:w16se="http://schemas.microsoft.com/office/word/2015/wordml/symex" mc:Ignorable="w14 w15 w16se w16cid w16 w16cex w16sdtdh w16sdtfl w16du">
   <w:docDefaults>
     <w:rPrDefault>
       <w:rPr>
@@ -7663,10 +7917,16 @@
 </file>
 
 <file path=customXml/item1.xml><?xml version="1.0" encoding="utf-8"?>
+<p:properties xmlns:p="http://schemas.microsoft.com/office/2006/metadata/properties" xmlns:xsi="http://www.w3.org/2001/XMLSchema-instance" xmlns:pc="http://schemas.microsoft.com/office/infopath/2007/PartnerControls">
+  <documentManagement/>
+</p:properties>
+</file>
+
+<file path=customXml/item2.xml><?xml version="1.0" encoding="utf-8"?>
 <b:Sources xmlns:b="http://schemas.openxmlformats.org/officeDocument/2006/bibliography" xmlns="http://schemas.openxmlformats.org/officeDocument/2006/bibliography" SelectedStyle="\APASixthEditionOfficeOnline.xsl" StyleName="APA" Version="6"/>
 </file>
 
-<file path=customXml/item2.xml><?xml version="1.0" encoding="utf-8"?>
+<file path=customXml/item3.xml><?xml version="1.0" encoding="utf-8"?>
 <ct:contentTypeSchema xmlns:ct="http://schemas.microsoft.com/office/2006/metadata/contentType" xmlns:ma="http://schemas.microsoft.com/office/2006/metadata/properties/metaAttributes" ct:_="" ma:_="" ma:contentTypeName="Document" ma:contentTypeID="0x01010004E2DA5DC3908146B4310B4560F6FEAC" ma:contentTypeVersion="3" ma:contentTypeDescription="Create a new document." ma:contentTypeScope="" ma:versionID="d488c977e6e9f92ef0d5f63182f5b8f2">
   <xsd:schema xmlns:xsd="http://www.w3.org/2001/XMLSchema" xmlns:xs="http://www.w3.org/2001/XMLSchema" xmlns:p="http://schemas.microsoft.com/office/2006/metadata/properties" xmlns:ns2="c25d3119-3d45-4b10-8dfa-ea26b820ff10" targetNamespace="http://schemas.microsoft.com/office/2006/metadata/properties" ma:root="true" ma:fieldsID="b1f65a2a753951693c10aa956bb5bf6e" ns2:_="">
     <xsd:import namespace="c25d3119-3d45-4b10-8dfa-ea26b820ff10"/>
@@ -7804,7 +8064,7 @@
 </ct:contentTypeSchema>
 </file>
 
-<file path=customXml/item3.xml><?xml version="1.0" encoding="utf-8"?>
+<file path=customXml/item4.xml><?xml version="1.0" encoding="utf-8"?>
 <?mso-contentType ?>
 <FormTemplates xmlns="http://schemas.microsoft.com/sharepoint/v3/contenttype/forms">
   <Display>DocumentLibraryForm</Display>
@@ -7813,13 +8073,16 @@
 </FormTemplates>
 </file>
 
-<file path=customXml/item4.xml><?xml version="1.0" encoding="utf-8"?>
-<p:properties xmlns:p="http://schemas.microsoft.com/office/2006/metadata/properties" xmlns:xsi="http://www.w3.org/2001/XMLSchema-instance" xmlns:pc="http://schemas.microsoft.com/office/infopath/2007/PartnerControls">
-  <documentManagement/>
-</p:properties>
+<file path=customXml/itemProps1.xml><?xml version="1.0" encoding="utf-8"?>
+<ds:datastoreItem xmlns:ds="http://schemas.openxmlformats.org/officeDocument/2006/customXml" ds:itemID="{C6D38FF4-08C2-4CD4-A87D-A7816E97EF06}">
+  <ds:schemaRefs>
+    <ds:schemaRef ds:uri="http://schemas.microsoft.com/office/2006/metadata/properties"/>
+    <ds:schemaRef ds:uri="http://schemas.microsoft.com/office/infopath/2007/PartnerControls"/>
+  </ds:schemaRefs>
+</ds:datastoreItem>
 </file>
 
-<file path=customXml/itemProps1.xml><?xml version="1.0" encoding="utf-8"?>
+<file path=customXml/itemProps2.xml><?xml version="1.0" encoding="utf-8"?>
 <ds:datastoreItem xmlns:ds="http://schemas.openxmlformats.org/officeDocument/2006/customXml" ds:itemID="{C0BC05C6-BC78-1947-BE40-CCCBC57524E2}">
   <ds:schemaRefs>
     <ds:schemaRef ds:uri="http://schemas.openxmlformats.org/officeDocument/2006/bibliography"/>
@@ -7827,14 +8090,28 @@
 </ds:datastoreItem>
 </file>
 
-<file path=customXml/itemProps2.xml><?xml version="1.0" encoding="utf-8"?>
-<ds:datastoreItem xmlns:ds="http://schemas.openxmlformats.org/officeDocument/2006/customXml" ds:itemID="{5A105C68-EF98-4324-B796-A72D16DFB167}"/>
-</file>
-
 <file path=customXml/itemProps3.xml><?xml version="1.0" encoding="utf-8"?>
-<ds:datastoreItem xmlns:ds="http://schemas.openxmlformats.org/officeDocument/2006/customXml" ds:itemID="{8A0E628D-1152-40BD-B22B-E27E63FFD1DC}"/>
+<ds:datastoreItem xmlns:ds="http://schemas.openxmlformats.org/officeDocument/2006/customXml" ds:itemID="{5A105C68-EF98-4324-B796-A72D16DFB167}">
+  <ds:schemaRefs>
+    <ds:schemaRef ds:uri="http://schemas.microsoft.com/office/2006/metadata/contentType"/>
+    <ds:schemaRef ds:uri="http://schemas.microsoft.com/office/2006/metadata/properties/metaAttributes"/>
+    <ds:schemaRef ds:uri="http://www.w3.org/2001/XMLSchema"/>
+    <ds:schemaRef ds:uri="http://schemas.microsoft.com/office/2006/metadata/properties"/>
+    <ds:schemaRef ds:uri="c25d3119-3d45-4b10-8dfa-ea26b820ff10"/>
+    <ds:schemaRef ds:uri="http://schemas.microsoft.com/office/2006/documentManagement/types"/>
+    <ds:schemaRef ds:uri="http://schemas.microsoft.com/office/infopath/2007/PartnerControls"/>
+    <ds:schemaRef ds:uri="http://schemas.openxmlformats.org/package/2006/metadata/core-properties"/>
+    <ds:schemaRef ds:uri="http://purl.org/dc/elements/1.1/"/>
+    <ds:schemaRef ds:uri="http://purl.org/dc/terms/"/>
+    <ds:schemaRef ds:uri="http://schemas.microsoft.com/internal/obd"/>
+  </ds:schemaRefs>
+</ds:datastoreItem>
 </file>
 
 <file path=customXml/itemProps4.xml><?xml version="1.0" encoding="utf-8"?>
-<ds:datastoreItem xmlns:ds="http://schemas.openxmlformats.org/officeDocument/2006/customXml" ds:itemID="{C6D38FF4-08C2-4CD4-A87D-A7816E97EF06}"/>
+<ds:datastoreItem xmlns:ds="http://schemas.openxmlformats.org/officeDocument/2006/customXml" ds:itemID="{8A0E628D-1152-40BD-B22B-E27E63FFD1DC}">
+  <ds:schemaRefs>
+    <ds:schemaRef ds:uri="http://schemas.microsoft.com/sharepoint/v3/contenttype/forms"/>
+  </ds:schemaRefs>
+</ds:datastoreItem>
 </file>
</xml_diff>